<commit_message>
Refactor Chapter Three SWE outline
</commit_message>
<xml_diff>
--- a/CBT System/drafts/Chapter 01 - Azeta Duke.docx
+++ b/CBT System/drafts/Chapter 01 - Azeta Duke.docx
@@ -4,6 +4,7 @@
   <w:body>
     <w:p>
       <w:pPr>
+        <w:spacing w:before="600" w:after="0" w:line="480" w:lineRule="auto"/>
         <w:jc w:val="center"/>
       </w:pPr>
       <w:r>
@@ -17,6 +18,7 @@
     </w:p>
     <w:p>
       <w:pPr>
+        <w:spacing w:before="160" w:after="0" w:line="480" w:lineRule="auto"/>
         <w:jc w:val="center"/>
       </w:pPr>
       <w:r>
@@ -30,6 +32,7 @@
     </w:p>
     <w:p>
       <w:pPr>
+        <w:spacing w:before="160" w:after="0" w:line="480" w:lineRule="auto"/>
         <w:jc w:val="left"/>
       </w:pPr>
       <w:r>
@@ -38,13 +41,13 @@
           <w:b/>
           <w:sz w:val="24"/>
         </w:rPr>
-        <w:t>1.1 Background of the Study</w:t>
+        <w:t>1.1 BACKGROUND OF THE STUDY</w:t>
       </w:r>
     </w:p>
     <w:p>
       <w:pPr>
-        <w:spacing w:after="80"/>
-        <w:ind w:firstLine="720"/>
+        <w:spacing w:after="0" w:before="220" w:line="480" w:lineRule="auto"/>
+        <w:ind w:left="202"/>
         <w:jc w:val="both"/>
       </w:pPr>
       <w:r>
@@ -57,8 +60,8 @@
     </w:p>
     <w:p>
       <w:pPr>
-        <w:spacing w:after="80"/>
-        <w:ind w:firstLine="720"/>
+        <w:spacing w:after="0" w:before="0" w:line="480" w:lineRule="auto"/>
+        <w:ind w:left="202"/>
         <w:jc w:val="both"/>
       </w:pPr>
       <w:r>
@@ -71,8 +74,8 @@
     </w:p>
     <w:p>
       <w:pPr>
-        <w:spacing w:after="80"/>
-        <w:ind w:firstLine="720"/>
+        <w:spacing w:after="0" w:before="0" w:line="480" w:lineRule="auto"/>
+        <w:ind w:left="202"/>
         <w:jc w:val="both"/>
       </w:pPr>
       <w:r>
@@ -85,8 +88,8 @@
     </w:p>
     <w:p>
       <w:pPr>
-        <w:spacing w:after="80"/>
-        <w:ind w:firstLine="720"/>
+        <w:spacing w:after="0" w:before="0" w:line="480" w:lineRule="auto"/>
+        <w:ind w:left="202"/>
         <w:jc w:val="both"/>
       </w:pPr>
       <w:r>
@@ -99,6 +102,7 @@
     </w:p>
     <w:p>
       <w:pPr>
+        <w:spacing w:before="160" w:after="0" w:line="480" w:lineRule="auto"/>
         <w:jc w:val="left"/>
       </w:pPr>
       <w:r>
@@ -107,13 +111,13 @@
           <w:b/>
           <w:sz w:val="24"/>
         </w:rPr>
-        <w:t>1.2 Statement of the Problem</w:t>
+        <w:t>1.2 STATEMENT OF THE PROBLEM</w:t>
       </w:r>
     </w:p>
     <w:p>
       <w:pPr>
-        <w:spacing w:after="80"/>
-        <w:ind w:firstLine="720"/>
+        <w:spacing w:after="0" w:before="220" w:line="480" w:lineRule="auto"/>
+        <w:ind w:left="202"/>
         <w:jc w:val="both"/>
       </w:pPr>
       <w:r>
@@ -126,8 +130,8 @@
     </w:p>
     <w:p>
       <w:pPr>
-        <w:spacing w:after="80"/>
-        <w:ind w:firstLine="720"/>
+        <w:spacing w:after="0" w:before="0" w:line="480" w:lineRule="auto"/>
+        <w:ind w:left="202"/>
         <w:jc w:val="both"/>
       </w:pPr>
       <w:r>
@@ -140,8 +144,8 @@
     </w:p>
     <w:p>
       <w:pPr>
-        <w:spacing w:after="80"/>
-        <w:ind w:firstLine="720"/>
+        <w:spacing w:after="0" w:before="0" w:line="480" w:lineRule="auto"/>
+        <w:ind w:left="202"/>
         <w:jc w:val="both"/>
       </w:pPr>
       <w:r>
@@ -154,6 +158,7 @@
     </w:p>
     <w:p>
       <w:pPr>
+        <w:spacing w:before="160" w:after="0" w:line="480" w:lineRule="auto"/>
         <w:jc w:val="left"/>
       </w:pPr>
       <w:r>
@@ -162,11 +167,12 @@
           <w:b/>
           <w:sz w:val="24"/>
         </w:rPr>
-        <w:t>1.3 Aim and Objectives of the Study</w:t>
+        <w:t>1.3 AIM AND OBJECTIVES OF THE STUDY</w:t>
       </w:r>
     </w:p>
     <w:p>
       <w:pPr>
+        <w:spacing w:before="160" w:after="0" w:line="480" w:lineRule="auto"/>
         <w:jc w:val="left"/>
       </w:pPr>
       <w:r>
@@ -175,13 +181,13 @@
           <w:b/>
           <w:sz w:val="24"/>
         </w:rPr>
-        <w:t>Aim</w:t>
+        <w:t>AIM</w:t>
       </w:r>
     </w:p>
     <w:p>
       <w:pPr>
-        <w:spacing w:after="80"/>
-        <w:ind w:firstLine="720"/>
+        <w:spacing w:after="0" w:before="220" w:line="480" w:lineRule="auto"/>
+        <w:ind w:left="202"/>
         <w:jc w:val="both"/>
       </w:pPr>
       <w:r>
@@ -194,6 +200,7 @@
     </w:p>
     <w:p>
       <w:pPr>
+        <w:spacing w:before="160" w:after="0" w:line="480" w:lineRule="auto"/>
         <w:jc w:val="left"/>
       </w:pPr>
       <w:r>
@@ -202,13 +209,13 @@
           <w:b/>
           <w:sz w:val="24"/>
         </w:rPr>
-        <w:t>Objectives of the Study</w:t>
+        <w:t>OBJECTIVES OF THE STUDY</w:t>
       </w:r>
     </w:p>
     <w:p>
       <w:pPr>
-        <w:spacing w:after="80"/>
-        <w:ind w:firstLine="720"/>
+        <w:spacing w:after="0" w:before="220" w:line="480" w:lineRule="auto"/>
+        <w:ind w:left="202"/>
         <w:jc w:val="both"/>
       </w:pPr>
       <w:r>
@@ -221,8 +228,8 @@
     </w:p>
     <w:p>
       <w:pPr>
-        <w:spacing w:after="80"/>
-        <w:ind w:firstLine="720"/>
+        <w:spacing w:after="0" w:before="0" w:line="480" w:lineRule="auto"/>
+        <w:ind w:left="202"/>
         <w:jc w:val="both"/>
       </w:pPr>
       <w:r>
@@ -235,8 +242,8 @@
     </w:p>
     <w:p>
       <w:pPr>
-        <w:spacing w:after="80"/>
-        <w:ind w:firstLine="720"/>
+        <w:spacing w:after="0" w:before="0" w:line="480" w:lineRule="auto"/>
+        <w:ind w:left="202"/>
         <w:jc w:val="both"/>
       </w:pPr>
       <w:r>
@@ -249,8 +256,8 @@
     </w:p>
     <w:p>
       <w:pPr>
-        <w:spacing w:after="80"/>
-        <w:ind w:firstLine="720"/>
+        <w:spacing w:after="0" w:before="0" w:line="480" w:lineRule="auto"/>
+        <w:ind w:left="202"/>
         <w:jc w:val="both"/>
       </w:pPr>
       <w:r>
@@ -263,8 +270,8 @@
     </w:p>
     <w:p>
       <w:pPr>
-        <w:spacing w:after="80"/>
-        <w:ind w:firstLine="720"/>
+        <w:spacing w:after="0" w:before="0" w:line="480" w:lineRule="auto"/>
+        <w:ind w:left="202"/>
         <w:jc w:val="both"/>
       </w:pPr>
       <w:r>
@@ -277,8 +284,8 @@
     </w:p>
     <w:p>
       <w:pPr>
-        <w:spacing w:after="80"/>
-        <w:ind w:firstLine="720"/>
+        <w:spacing w:after="0" w:before="0" w:line="480" w:lineRule="auto"/>
+        <w:ind w:left="202"/>
         <w:jc w:val="both"/>
       </w:pPr>
       <w:r>
@@ -291,8 +298,8 @@
     </w:p>
     <w:p>
       <w:pPr>
-        <w:spacing w:after="80"/>
-        <w:ind w:firstLine="720"/>
+        <w:spacing w:after="0" w:before="0" w:line="480" w:lineRule="auto"/>
+        <w:ind w:left="202"/>
         <w:jc w:val="both"/>
       </w:pPr>
       <w:r>
@@ -305,8 +312,8 @@
     </w:p>
     <w:p>
       <w:pPr>
-        <w:spacing w:after="80"/>
-        <w:ind w:firstLine="720"/>
+        <w:spacing w:after="0" w:before="0" w:line="480" w:lineRule="auto"/>
+        <w:ind w:left="202"/>
         <w:jc w:val="both"/>
       </w:pPr>
       <w:r>
@@ -319,6 +326,7 @@
     </w:p>
     <w:p>
       <w:pPr>
+        <w:spacing w:before="160" w:after="0" w:line="480" w:lineRule="auto"/>
         <w:jc w:val="left"/>
       </w:pPr>
       <w:r>
@@ -327,13 +335,13 @@
           <w:b/>
           <w:sz w:val="24"/>
         </w:rPr>
-        <w:t>1.4 Significance of the Study</w:t>
+        <w:t>1.4 SIGNIFICANCE OF THE STUDY</w:t>
       </w:r>
     </w:p>
     <w:p>
       <w:pPr>
-        <w:spacing w:after="80"/>
-        <w:ind w:firstLine="720"/>
+        <w:spacing w:after="0" w:before="220" w:line="480" w:lineRule="auto"/>
+        <w:ind w:left="202"/>
         <w:jc w:val="both"/>
       </w:pPr>
       <w:r>
@@ -346,8 +354,8 @@
     </w:p>
     <w:p>
       <w:pPr>
-        <w:spacing w:after="80"/>
-        <w:ind w:firstLine="720"/>
+        <w:spacing w:after="0" w:before="0" w:line="480" w:lineRule="auto"/>
+        <w:ind w:left="202"/>
         <w:jc w:val="both"/>
       </w:pPr>
       <w:r>
@@ -360,6 +368,7 @@
     </w:p>
     <w:p>
       <w:pPr>
+        <w:spacing w:before="160" w:after="0" w:line="480" w:lineRule="auto"/>
         <w:jc w:val="left"/>
       </w:pPr>
       <w:r>
@@ -368,13 +377,13 @@
           <w:b/>
           <w:sz w:val="24"/>
         </w:rPr>
-        <w:t>1.5 Scope of the Study</w:t>
+        <w:t>1.5 SCOPE OF THE STUDY</w:t>
       </w:r>
     </w:p>
     <w:p>
       <w:pPr>
-        <w:spacing w:after="80"/>
-        <w:ind w:firstLine="720"/>
+        <w:spacing w:after="0" w:before="220" w:line="480" w:lineRule="auto"/>
+        <w:ind w:left="202"/>
         <w:jc w:val="both"/>
       </w:pPr>
       <w:r>
@@ -387,8 +396,8 @@
     </w:p>
     <w:p>
       <w:pPr>
-        <w:spacing w:after="80"/>
-        <w:ind w:firstLine="720"/>
+        <w:spacing w:after="0" w:before="0" w:line="480" w:lineRule="auto"/>
+        <w:ind w:left="202"/>
         <w:jc w:val="both"/>
       </w:pPr>
       <w:r>
@@ -401,8 +410,8 @@
     </w:p>
     <w:p>
       <w:pPr>
-        <w:spacing w:after="80"/>
-        <w:ind w:firstLine="720"/>
+        <w:spacing w:after="0" w:before="0" w:line="480" w:lineRule="auto"/>
+        <w:ind w:left="202"/>
         <w:jc w:val="both"/>
       </w:pPr>
       <w:r>
@@ -415,6 +424,7 @@
     </w:p>
     <w:p>
       <w:pPr>
+        <w:spacing w:before="160" w:after="0" w:line="480" w:lineRule="auto"/>
         <w:jc w:val="left"/>
       </w:pPr>
       <w:r>
@@ -423,12 +433,13 @@
           <w:b/>
           <w:sz w:val="24"/>
         </w:rPr>
-        <w:t>1.6 Definition of Terms</w:t>
+        <w:t>1.6 DEFINITION OF TERMS</w:t>
       </w:r>
     </w:p>
     <w:p>
       <w:pPr>
-        <w:spacing w:after="80"/>
+        <w:spacing w:after="0" w:before="0" w:line="480" w:lineRule="auto"/>
+        <w:ind w:left="202"/>
         <w:jc w:val="both"/>
       </w:pPr>
       <w:r>
@@ -449,7 +460,8 @@
     </w:p>
     <w:p>
       <w:pPr>
-        <w:spacing w:after="80"/>
+        <w:spacing w:after="0" w:before="0" w:line="480" w:lineRule="auto"/>
+        <w:ind w:left="202"/>
         <w:jc w:val="both"/>
       </w:pPr>
       <w:r>
@@ -470,7 +482,8 @@
     </w:p>
     <w:p>
       <w:pPr>
-        <w:spacing w:after="80"/>
+        <w:spacing w:after="0" w:before="0" w:line="480" w:lineRule="auto"/>
+        <w:ind w:left="202"/>
         <w:jc w:val="both"/>
       </w:pPr>
       <w:r>
@@ -491,7 +504,8 @@
     </w:p>
     <w:p>
       <w:pPr>
-        <w:spacing w:after="80"/>
+        <w:spacing w:after="0" w:before="0" w:line="480" w:lineRule="auto"/>
+        <w:ind w:left="202"/>
         <w:jc w:val="both"/>
       </w:pPr>
       <w:r>
@@ -512,7 +526,8 @@
     </w:p>
     <w:p>
       <w:pPr>
-        <w:spacing w:after="80"/>
+        <w:spacing w:after="0" w:before="0" w:line="480" w:lineRule="auto"/>
+        <w:ind w:left="202"/>
         <w:jc w:val="both"/>
       </w:pPr>
       <w:r>
@@ -533,7 +548,8 @@
     </w:p>
     <w:p>
       <w:pPr>
-        <w:spacing w:after="80"/>
+        <w:spacing w:after="0" w:before="0" w:line="480" w:lineRule="auto"/>
+        <w:ind w:left="202"/>
         <w:jc w:val="both"/>
       </w:pPr>
       <w:r>
@@ -554,7 +570,8 @@
     </w:p>
     <w:p>
       <w:pPr>
-        <w:spacing w:after="80"/>
+        <w:spacing w:after="0" w:before="0" w:line="480" w:lineRule="auto"/>
+        <w:ind w:left="202"/>
         <w:jc w:val="both"/>
       </w:pPr>
       <w:r>
@@ -575,7 +592,8 @@
     </w:p>
     <w:p>
       <w:pPr>
-        <w:spacing w:after="80"/>
+        <w:spacing w:after="0" w:before="0" w:line="480" w:lineRule="auto"/>
+        <w:ind w:left="202"/>
         <w:jc w:val="both"/>
       </w:pPr>
       <w:r>
@@ -595,13 +613,36 @@
       </w:r>
     </w:p>
     <w:sectPr>
+      <w:footerReference w:type="default" r:id="rId9"/>
       <w:pgSz w:w="12240" w:h="15840"/>
       <w:pgMar w:top="1440" w:right="1440" w:bottom="1440" w:left="1440" w:header="720" w:footer="720" w:gutter="0"/>
       <w:cols w:space="720"/>
       <w:docGrid w:linePitch="360"/>
+      <w:pgNumType w:start="1" w:fmt="decimal"/>
     </w:sectPr>
   </w:body>
 </w:document>
+</file>
+
+<file path=word/footer1.xml><?xml version="1.0" encoding="utf-8"?>
+<w:ftr xmlns:m="http://schemas.openxmlformats.org/officeDocument/2006/math" xmlns:mc="http://schemas.openxmlformats.org/markup-compatibility/2006" xmlns:mo="http://schemas.microsoft.com/office/mac/office/2008/main" xmlns:mv="urn:schemas-microsoft-com:mac:vml" xmlns:o="urn:schemas-microsoft-com:office:office" xmlns:r="http://schemas.openxmlformats.org/officeDocument/2006/relationships" xmlns:v="urn:schemas-microsoft-com:vml" xmlns:w10="urn:schemas-microsoft-com:office:word" xmlns:w14="http://schemas.microsoft.com/office/word/2010/wordml" xmlns:w="http://schemas.openxmlformats.org/wordprocessingml/2006/main" xmlns:wne="http://schemas.microsoft.com/office/word/2006/wordml" xmlns:wp14="http://schemas.microsoft.com/office/word/2010/wordprocessingDrawing" xmlns:wp="http://schemas.openxmlformats.org/drawingml/2006/wordprocessingDrawing" xmlns:wpc="http://schemas.microsoft.com/office/word/2010/wordprocessingCanvas" xmlns:wpg="http://schemas.microsoft.com/office/word/2010/wordprocessingGroup" xmlns:wpi="http://schemas.microsoft.com/office/word/2010/wordprocessingInk" xmlns:wps="http://schemas.microsoft.com/office/word/2010/wordprocessingShape" mc:Ignorable="w14 wp14">
+  <w:p>
+    <w:pPr>
+      <w:pStyle w:val="Footer"/>
+      <w:jc w:val="center"/>
+    </w:pPr>
+    <w:r>
+      <w:rPr>
+        <w:rFonts w:ascii="Times New Roman" w:hAnsi="Times New Roman" w:eastAsia="Times New Roman"/>
+        <w:color w:val="000000"/>
+        <w:sz w:val="24"/>
+      </w:rPr>
+      <w:fldChar w:fldCharType="begin"/>
+      <w:instrText xml:space="preserve"> PAGE </w:instrText>
+      <w:fldChar w:fldCharType="end"/>
+    </w:r>
+  </w:p>
+</w:ftr>
 </file>
 
 <file path=word/numbering.xml><?xml version="1.0" encoding="utf-8"?>
@@ -967,6 +1008,10 @@
     <w:name w:val="Normal"/>
     <w:qFormat/>
     <w:rsid w:val="00FC693F"/>
+    <w:pPr>
+      <w:spacing w:before="0" w:after="0"/>
+      <w:ind w:left="0"/>
+    </w:pPr>
     <w:rPr>
       <w:rFonts w:ascii="Times New Roman" w:hAnsi="Times New Roman" w:eastAsia="Times New Roman"/>
       <w:sz w:val="24"/>

</xml_diff>